<commit_message>
Cotinue the fortress thm ctf challenge
</commit_message>
<xml_diff>
--- a/THM_challenges/Medium/Fortress/Fortress_Solution_Documentation.docx
+++ b/THM_challenges/Medium/Fortress/Fortress_Solution_Documentation.docx
@@ -775,6 +775,7 @@
       </w:pPr>
       <w:r>
         <w:rPr>
+          <w:noProof/>
           <w:sz w:val="26"/>
           <w:szCs w:val="26"/>
         </w:rPr>
@@ -842,7 +843,21 @@
           <w:sz w:val="26"/>
           <w:szCs w:val="26"/>
         </w:rPr>
-        <w:t xml:space="preserve"> managed to do that because I got now permission to create </w:t>
+        <w:t xml:space="preserve"> managed to do that because I got no</w:t>
+      </w:r>
+      <w:r>
+        <w:rPr>
+          <w:sz w:val="26"/>
+          <w:szCs w:val="26"/>
+        </w:rPr>
+        <w:t xml:space="preserve"> </w:t>
+      </w:r>
+      <w:r>
+        <w:rPr>
+          <w:sz w:val="26"/>
+          <w:szCs w:val="26"/>
+        </w:rPr>
+        <w:t xml:space="preserve">permission to create </w:t>
       </w:r>
       <w:r>
         <w:rPr>
@@ -907,91 +922,161 @@
         </w:rPr>
         <w:t xml:space="preserve"> </w:t>
       </w:r>
-    </w:p>
-    <w:p>
-      <w:pPr>
-        <w:rPr>
-          <w:sz w:val="26"/>
-          <w:szCs w:val="26"/>
-        </w:rPr>
-      </w:pPr>
-      <w:r>
-        <w:rPr>
-          <w:sz w:val="26"/>
-          <w:szCs w:val="26"/>
-        </w:rPr>
-        <w:t xml:space="preserve">I found </w:t>
-      </w:r>
-      <w:r>
-        <w:rPr>
-          <w:sz w:val="26"/>
-          <w:szCs w:val="26"/>
-        </w:rPr>
-        <w:t xml:space="preserve">that it vulnerable to </w:t>
-      </w:r>
-      <w:r>
-        <w:rPr>
-          <w:sz w:val="26"/>
-          <w:szCs w:val="26"/>
-        </w:rPr>
-        <w:t xml:space="preserve">a </w:t>
-      </w:r>
-      <w:r>
-        <w:rPr>
-          <w:sz w:val="26"/>
-          <w:szCs w:val="26"/>
-        </w:rPr>
-        <w:t>remote denial of service attack (</w:t>
-      </w:r>
-      <w:r>
-        <w:rPr>
-          <w:sz w:val="26"/>
-          <w:szCs w:val="26"/>
-        </w:rPr>
-        <w:t>CVE-2021-30047</w:t>
-      </w:r>
-      <w:r>
-        <w:rPr>
-          <w:sz w:val="26"/>
-          <w:szCs w:val="26"/>
-        </w:rPr>
-        <w:t>)</w:t>
-      </w:r>
-      <w:r>
-        <w:rPr>
-          <w:sz w:val="26"/>
-          <w:szCs w:val="26"/>
-        </w:rPr>
-        <w:t>.</w:t>
-      </w:r>
-    </w:p>
-    <w:p>
-      <w:pPr>
-        <w:rPr>
-          <w:sz w:val="26"/>
-          <w:szCs w:val="26"/>
-        </w:rPr>
-      </w:pPr>
-      <w:r>
-        <w:rPr>
-          <w:sz w:val="26"/>
-          <w:szCs w:val="26"/>
-        </w:rPr>
-        <w:t>In that instant</w:t>
-      </w:r>
-      <w:r>
-        <w:rPr>
-          <w:sz w:val="26"/>
-          <w:szCs w:val="26"/>
-        </w:rPr>
-        <w:t xml:space="preserve">, I </w:t>
-      </w:r>
-      <w:r>
-        <w:rPr>
-          <w:sz w:val="26"/>
-          <w:szCs w:val="26"/>
-        </w:rPr>
-        <w:t>downloaded the exploit of this vulnerability</w:t>
+      <w:r>
+        <w:rPr>
+          <w:sz w:val="26"/>
+          <w:szCs w:val="26"/>
+        </w:rPr>
+        <w:t xml:space="preserve">I found no useful exploit for this </w:t>
+      </w:r>
+      <w:r>
+        <w:rPr>
+          <w:sz w:val="26"/>
+          <w:szCs w:val="26"/>
+        </w:rPr>
+        <w:t>mission,</w:t>
+      </w:r>
+      <w:r>
+        <w:rPr>
+          <w:sz w:val="26"/>
+          <w:szCs w:val="26"/>
+        </w:rPr>
+        <w:t xml:space="preserve"> </w:t>
+      </w:r>
+      <w:r>
+        <w:rPr>
+          <w:sz w:val="26"/>
+          <w:szCs w:val="26"/>
+        </w:rPr>
+        <w:t>so I left it.</w:t>
+      </w:r>
+    </w:p>
+    <w:p>
+      <w:pPr>
+        <w:rPr>
+          <w:sz w:val="26"/>
+          <w:szCs w:val="26"/>
+        </w:rPr>
+      </w:pPr>
+      <w:r>
+        <w:rPr>
+          <w:sz w:val="26"/>
+          <w:szCs w:val="26"/>
+        </w:rPr>
+        <w:t xml:space="preserve"> </w:t>
+      </w:r>
+      <w:r>
+        <w:rPr>
+          <w:sz w:val="26"/>
+          <w:szCs w:val="26"/>
+        </w:rPr>
+        <w:t xml:space="preserve">At this point, I </w:t>
+      </w:r>
+      <w:r>
+        <w:rPr>
+          <w:sz w:val="26"/>
+          <w:szCs w:val="26"/>
+        </w:rPr>
+        <w:t xml:space="preserve">moved to </w:t>
+      </w:r>
+      <w:r>
+        <w:rPr>
+          <w:sz w:val="26"/>
+          <w:szCs w:val="26"/>
+        </w:rPr>
+        <w:t>try and use port 5752</w:t>
+      </w:r>
+      <w:r>
+        <w:rPr>
+          <w:sz w:val="26"/>
+          <w:szCs w:val="26"/>
+        </w:rPr>
+        <w:t>. I performed advanced Nmap scan to reveal more information about the service t</w:t>
+      </w:r>
+      <w:r>
+        <w:rPr>
+          <w:sz w:val="26"/>
+          <w:szCs w:val="26"/>
+        </w:rPr>
+        <w:t xml:space="preserve">hat runs on this </w:t>
+      </w:r>
+      <w:r>
+        <w:rPr>
+          <w:sz w:val="26"/>
+          <w:szCs w:val="26"/>
+        </w:rPr>
+        <w:t>port,</w:t>
+      </w:r>
+      <w:r>
+        <w:rPr>
+          <w:sz w:val="26"/>
+          <w:szCs w:val="26"/>
+        </w:rPr>
+        <w:t xml:space="preserve"> but I found nothing. I also checked on the internet and saw that this port </w:t>
+      </w:r>
+      <w:r>
+        <w:rPr>
+          <w:sz w:val="26"/>
+          <w:szCs w:val="26"/>
+        </w:rPr>
+        <w:t>isn’t</w:t>
+      </w:r>
+      <w:r>
+        <w:rPr>
+          <w:sz w:val="26"/>
+          <w:szCs w:val="26"/>
+        </w:rPr>
+        <w:t xml:space="preserve"> associated with any specific service.</w:t>
+      </w:r>
+    </w:p>
+    <w:p>
+      <w:pPr>
+        <w:rPr>
+          <w:sz w:val="26"/>
+          <w:szCs w:val="26"/>
+        </w:rPr>
+      </w:pPr>
+      <w:r>
+        <w:rPr>
+          <w:sz w:val="26"/>
+          <w:szCs w:val="26"/>
+        </w:rPr>
+        <w:t xml:space="preserve">I thought what can I do with it, and suddenly I </w:t>
+      </w:r>
+      <w:r>
+        <w:rPr>
+          <w:sz w:val="26"/>
+          <w:szCs w:val="26"/>
+        </w:rPr>
+        <w:t>had a lightbulb moment.</w:t>
+      </w:r>
+      <w:r>
+        <w:rPr>
+          <w:sz w:val="26"/>
+          <w:szCs w:val="26"/>
+        </w:rPr>
+        <w:t xml:space="preserve"> I realized that I </w:t>
+      </w:r>
+      <w:r>
+        <w:rPr>
+          <w:sz w:val="26"/>
+          <w:szCs w:val="26"/>
+        </w:rPr>
+        <w:t>could</w:t>
+      </w:r>
+      <w:r>
+        <w:rPr>
+          <w:sz w:val="26"/>
+          <w:szCs w:val="26"/>
+        </w:rPr>
+        <w:t xml:space="preserve"> connect to it via nc and this was a smart move</w:t>
+      </w:r>
+      <w:r>
+        <w:rPr>
+          <w:sz w:val="26"/>
+          <w:szCs w:val="26"/>
+        </w:rPr>
+        <w:t xml:space="preserve"> because when I tried it I was faced with a login page</w:t>
       </w:r>
       <w:r>
         <w:rPr>
@@ -1010,13 +1095,14 @@
       </w:pPr>
       <w:r>
         <w:rPr>
-          <w:noProof/>
+          <w:sz w:val="26"/>
+          <w:szCs w:val="26"/>
         </w:rPr>
         <w:drawing>
-          <wp:inline distT="0" distB="0" distL="0" distR="0" wp14:anchorId="536087F3" wp14:editId="5AFAE12C">
-            <wp:extent cx="7556500" cy="3021330"/>
-            <wp:effectExtent l="0" t="0" r="6350" b="7620"/>
-            <wp:docPr id="1790783611" name="תמונה 1" descr="תמונה שמכילה צילום מסך, טקסט&#10;&#10;תוכן בינה מלאכותית גנרטיבית עשוי להיות שגוי."/>
+          <wp:inline distT="0" distB="0" distL="0" distR="0" wp14:anchorId="76E41495" wp14:editId="652E2F46">
+            <wp:extent cx="3284639" cy="1436370"/>
+            <wp:effectExtent l="0" t="0" r="0" b="0"/>
+            <wp:docPr id="719505272" name="תמונה 1"/>
             <wp:cNvGraphicFramePr>
               <a:graphicFrameLocks xmlns:a="http://schemas.openxmlformats.org/drawingml/2006/main" noChangeAspect="1"/>
             </wp:cNvGraphicFramePr>
@@ -1024,7 +1110,7 @@
               <a:graphicData uri="http://schemas.openxmlformats.org/drawingml/2006/picture">
                 <pic:pic xmlns:pic="http://schemas.openxmlformats.org/drawingml/2006/picture">
                   <pic:nvPicPr>
-                    <pic:cNvPr id="1790783611" name="תמונה 1" descr="תמונה שמכילה צילום מסך, טקסט&#10;&#10;תוכן בינה מלאכותית גנרטיבית עשוי להיות שגוי."/>
+                    <pic:cNvPr id="719505272" name=""/>
                     <pic:cNvPicPr/>
                   </pic:nvPicPr>
                   <pic:blipFill>
@@ -1036,7 +1122,7 @@
                   <pic:spPr>
                     <a:xfrm>
                       <a:off x="0" y="0"/>
-                      <a:ext cx="7556500" cy="3021330"/>
+                      <a:ext cx="3289829" cy="1438639"/>
                     </a:xfrm>
                     <a:prstGeom prst="rect">
                       <a:avLst/>
@@ -1048,15 +1134,59 @@
           </wp:inline>
         </w:drawing>
       </w:r>
+    </w:p>
+    <w:p>
+      <w:pPr>
+        <w:rPr>
+          <w:sz w:val="26"/>
+          <w:szCs w:val="26"/>
+        </w:rPr>
+      </w:pPr>
+      <w:r>
+        <w:rPr>
+          <w:sz w:val="26"/>
+          <w:szCs w:val="26"/>
+        </w:rPr>
+        <w:t xml:space="preserve">I tried to use the anonymous </w:t>
+      </w:r>
+      <w:r>
+        <w:rPr>
+          <w:sz w:val="26"/>
+          <w:szCs w:val="26"/>
+        </w:rPr>
+        <w:t xml:space="preserve">credentials </w:t>
+      </w:r>
+      <w:r>
+        <w:rPr>
+          <w:sz w:val="26"/>
+          <w:szCs w:val="26"/>
+        </w:rPr>
+        <w:t>again,</w:t>
+      </w:r>
+      <w:r>
+        <w:rPr>
+          <w:sz w:val="26"/>
+          <w:szCs w:val="26"/>
+        </w:rPr>
+        <w:t xml:space="preserve"> but it failed:</w:t>
+      </w:r>
+    </w:p>
+    <w:p>
+      <w:pPr>
+        <w:rPr>
+          <w:sz w:val="26"/>
+          <w:szCs w:val="26"/>
+        </w:rPr>
+      </w:pPr>
       <w:r>
         <w:rPr>
           <w:noProof/>
         </w:rPr>
         <w:drawing>
-          <wp:inline distT="0" distB="0" distL="0" distR="0" wp14:anchorId="35426F8F" wp14:editId="038DDE3F">
-            <wp:extent cx="7556500" cy="3060700"/>
-            <wp:effectExtent l="0" t="0" r="6350" b="6350"/>
-            <wp:docPr id="1055584549" name="תמונה 1" descr="תמונה שמכילה צילום מסך, טקסט&#10;&#10;תוכן בינה מלאכותית גנרטיבית עשוי להיות שגוי."/>
+          <wp:inline distT="0" distB="0" distL="0" distR="0" wp14:anchorId="2DA0E703" wp14:editId="7EA91618">
+            <wp:extent cx="3185160" cy="1122390"/>
+            <wp:effectExtent l="0" t="0" r="0" b="1905"/>
+            <wp:docPr id="1357473708" name="תמונה 1" descr="תמונה שמכילה טקסט, גופן, צילום מסך&#10;&#10;תוכן בינה מלאכותית גנרטיבית עשוי להיות שגוי."/>
             <wp:cNvGraphicFramePr>
               <a:graphicFrameLocks xmlns:a="http://schemas.openxmlformats.org/drawingml/2006/main" noChangeAspect="1"/>
             </wp:cNvGraphicFramePr>
@@ -1064,7 +1194,7 @@
               <a:graphicData uri="http://schemas.openxmlformats.org/drawingml/2006/picture">
                 <pic:pic xmlns:pic="http://schemas.openxmlformats.org/drawingml/2006/picture">
                   <pic:nvPicPr>
-                    <pic:cNvPr id="1055584549" name="תמונה 1" descr="תמונה שמכילה צילום מסך, טקסט&#10;&#10;תוכן בינה מלאכותית גנרטיבית עשוי להיות שגוי."/>
+                    <pic:cNvPr id="1357473708" name="תמונה 1" descr="תמונה שמכילה טקסט, גופן, צילום מסך&#10;&#10;תוכן בינה מלאכותית גנרטיבית עשוי להיות שגוי."/>
                     <pic:cNvPicPr/>
                   </pic:nvPicPr>
                   <pic:blipFill>
@@ -1076,7 +1206,7 @@
                   <pic:spPr>
                     <a:xfrm>
                       <a:off x="0" y="0"/>
-                      <a:ext cx="7556500" cy="3060700"/>
+                      <a:ext cx="3194976" cy="1125849"/>
                     </a:xfrm>
                     <a:prstGeom prst="rect">
                       <a:avLst/>
@@ -1088,16 +1218,95 @@
           </wp:inline>
         </w:drawing>
       </w:r>
+    </w:p>
+    <w:p>
+      <w:pPr>
+        <w:rPr>
+          <w:sz w:val="26"/>
+          <w:szCs w:val="26"/>
+        </w:rPr>
+      </w:pPr>
+      <w:r>
+        <w:rPr>
+          <w:sz w:val="26"/>
+          <w:szCs w:val="26"/>
+        </w:rPr>
+        <w:t xml:space="preserve">I </w:t>
+      </w:r>
+      <w:r>
+        <w:rPr>
+          <w:sz w:val="26"/>
+          <w:szCs w:val="26"/>
+        </w:rPr>
+        <w:t>tried</w:t>
+      </w:r>
+      <w:r>
+        <w:rPr>
+          <w:sz w:val="26"/>
+          <w:szCs w:val="26"/>
+        </w:rPr>
+        <w:t xml:space="preserve"> several other common credentials, but </w:t>
+      </w:r>
+      <w:r>
+        <w:rPr>
+          <w:sz w:val="26"/>
+          <w:szCs w:val="26"/>
+        </w:rPr>
+        <w:t>none</w:t>
+      </w:r>
+      <w:r>
+        <w:rPr>
+          <w:sz w:val="26"/>
+          <w:szCs w:val="26"/>
+        </w:rPr>
+        <w:t xml:space="preserve"> of them worked</w:t>
+      </w:r>
+      <w:r>
+        <w:rPr>
+          <w:sz w:val="26"/>
+          <w:szCs w:val="26"/>
+        </w:rPr>
+        <w:t>, so</w:t>
+      </w:r>
+      <w:r>
+        <w:rPr>
+          <w:sz w:val="26"/>
+          <w:szCs w:val="26"/>
+        </w:rPr>
+        <w:t>, I moved to the next http port 7331</w:t>
+      </w:r>
+      <w:r>
+        <w:rPr>
+          <w:sz w:val="26"/>
+          <w:szCs w:val="26"/>
+        </w:rPr>
+        <w:t>.</w:t>
+      </w:r>
+    </w:p>
+    <w:p>
+      <w:pPr>
+        <w:rPr>
+          <w:sz w:val="26"/>
+          <w:szCs w:val="26"/>
+        </w:rPr>
+      </w:pPr>
+      <w:r>
+        <w:rPr>
+          <w:sz w:val="26"/>
+          <w:szCs w:val="26"/>
+        </w:rPr>
+        <w:t xml:space="preserve"> </w:t>
+      </w:r>
       <w:r>
         <w:rPr>
           <w:sz w:val="26"/>
           <w:szCs w:val="26"/>
         </w:rPr>
         <w:drawing>
-          <wp:inline distT="0" distB="0" distL="0" distR="0" wp14:anchorId="5F042E39" wp14:editId="72F13559">
-            <wp:extent cx="7556500" cy="1568450"/>
-            <wp:effectExtent l="0" t="0" r="6350" b="0"/>
-            <wp:docPr id="2074391707" name="תמונה 1" descr="תמונה שמכילה טקסט, צילום מסך&#10;&#10;תוכן בינה מלאכותית גנרטיבית עשוי להיות שגוי."/>
+          <wp:inline distT="0" distB="0" distL="0" distR="0" wp14:anchorId="1F75FEB1" wp14:editId="282BA0CC">
+            <wp:extent cx="7303770" cy="3745790"/>
+            <wp:effectExtent l="0" t="0" r="0" b="7620"/>
+            <wp:docPr id="577341089" name="תמונה 1"/>
             <wp:cNvGraphicFramePr>
               <a:graphicFrameLocks xmlns:a="http://schemas.openxmlformats.org/drawingml/2006/main" noChangeAspect="1"/>
             </wp:cNvGraphicFramePr>
@@ -1105,7 +1314,7 @@
               <a:graphicData uri="http://schemas.openxmlformats.org/drawingml/2006/picture">
                 <pic:pic xmlns:pic="http://schemas.openxmlformats.org/drawingml/2006/picture">
                   <pic:nvPicPr>
-                    <pic:cNvPr id="2074391707" name="תמונה 1" descr="תמונה שמכילה טקסט, צילום מסך&#10;&#10;תוכן בינה מלאכותית גנרטיבית עשוי להיות שגוי."/>
+                    <pic:cNvPr id="577341089" name=""/>
                     <pic:cNvPicPr/>
                   </pic:nvPicPr>
                   <pic:blipFill>
@@ -1117,7 +1326,7 @@
                   <pic:spPr>
                     <a:xfrm>
                       <a:off x="0" y="0"/>
-                      <a:ext cx="7556500" cy="1568450"/>
+                      <a:ext cx="7320740" cy="3754493"/>
                     </a:xfrm>
                     <a:prstGeom prst="rect">
                       <a:avLst/>
@@ -1142,8 +1351,434 @@
           <w:sz w:val="26"/>
           <w:szCs w:val="26"/>
         </w:rPr>
-        <w:t>At this point, all that left was to understand how the attack’s behavior and execute it.</w:t>
-      </w:r>
+        <w:lastRenderedPageBreak/>
+        <w:t>I noticed that this is</w:t>
+      </w:r>
+      <w:r>
+        <w:rPr>
+          <w:sz w:val="26"/>
+          <w:szCs w:val="26"/>
+        </w:rPr>
+        <w:t xml:space="preserve"> an Apache http server</w:t>
+      </w:r>
+      <w:r>
+        <w:rPr>
+          <w:sz w:val="26"/>
+          <w:szCs w:val="26"/>
+        </w:rPr>
+        <w:t>. I enumerated directories on this port using Gobuster</w:t>
+      </w:r>
+      <w:r>
+        <w:rPr>
+          <w:sz w:val="26"/>
+          <w:szCs w:val="26"/>
+        </w:rPr>
+        <w:t xml:space="preserve"> but this time I also added file extensions to enumerate also files(not only directories)</w:t>
+      </w:r>
+      <w:r>
+        <w:rPr>
+          <w:sz w:val="26"/>
+          <w:szCs w:val="26"/>
+        </w:rPr>
+        <w:t>:</w:t>
+      </w:r>
+    </w:p>
+    <w:p>
+      <w:pPr>
+        <w:rPr>
+          <w:sz w:val="26"/>
+          <w:szCs w:val="26"/>
+          <w:rtl/>
+        </w:rPr>
+      </w:pPr>
+      <w:r>
+        <w:rPr>
+          <w:sz w:val="26"/>
+          <w:szCs w:val="26"/>
+        </w:rPr>
+        <w:drawing>
+          <wp:inline distT="0" distB="0" distL="0" distR="0" wp14:anchorId="0834D44F" wp14:editId="6DC19883">
+            <wp:extent cx="6039373" cy="5010584"/>
+            <wp:effectExtent l="0" t="0" r="0" b="0"/>
+            <wp:docPr id="1215222294" name="תמונה 1"/>
+            <wp:cNvGraphicFramePr>
+              <a:graphicFrameLocks xmlns:a="http://schemas.openxmlformats.org/drawingml/2006/main" noChangeAspect="1"/>
+            </wp:cNvGraphicFramePr>
+            <a:graphic xmlns:a="http://schemas.openxmlformats.org/drawingml/2006/main">
+              <a:graphicData uri="http://schemas.openxmlformats.org/drawingml/2006/picture">
+                <pic:pic xmlns:pic="http://schemas.openxmlformats.org/drawingml/2006/picture">
+                  <pic:nvPicPr>
+                    <pic:cNvPr id="1215222294" name=""/>
+                    <pic:cNvPicPr/>
+                  </pic:nvPicPr>
+                  <pic:blipFill>
+                    <a:blip r:embed="rId16"/>
+                    <a:stretch>
+                      <a:fillRect/>
+                    </a:stretch>
+                  </pic:blipFill>
+                  <pic:spPr>
+                    <a:xfrm>
+                      <a:off x="0" y="0"/>
+                      <a:ext cx="6039373" cy="5010584"/>
+                    </a:xfrm>
+                    <a:prstGeom prst="rect">
+                      <a:avLst/>
+                    </a:prstGeom>
+                  </pic:spPr>
+                </pic:pic>
+              </a:graphicData>
+            </a:graphic>
+          </wp:inline>
+        </w:drawing>
+      </w:r>
+    </w:p>
+    <w:p>
+      <w:pPr>
+        <w:rPr>
+          <w:sz w:val="26"/>
+          <w:szCs w:val="26"/>
+        </w:rPr>
+      </w:pPr>
+      <w:r>
+        <w:rPr>
+          <w:sz w:val="26"/>
+          <w:szCs w:val="26"/>
+        </w:rPr>
+        <w:t>The “private.php” got my attention, so I checked it:</w:t>
+      </w:r>
+    </w:p>
+    <w:p>
+      <w:pPr>
+        <w:rPr>
+          <w:sz w:val="26"/>
+          <w:szCs w:val="26"/>
+        </w:rPr>
+      </w:pPr>
+      <w:r>
+        <w:rPr>
+          <w:sz w:val="26"/>
+          <w:szCs w:val="26"/>
+        </w:rPr>
+        <w:drawing>
+          <wp:inline distT="0" distB="0" distL="0" distR="0" wp14:anchorId="41C2FD33" wp14:editId="15211A25">
+            <wp:extent cx="4842510" cy="3397895"/>
+            <wp:effectExtent l="0" t="0" r="0" b="0"/>
+            <wp:docPr id="150056736" name="תמונה 1"/>
+            <wp:cNvGraphicFramePr>
+              <a:graphicFrameLocks xmlns:a="http://schemas.openxmlformats.org/drawingml/2006/main" noChangeAspect="1"/>
+            </wp:cNvGraphicFramePr>
+            <a:graphic xmlns:a="http://schemas.openxmlformats.org/drawingml/2006/main">
+              <a:graphicData uri="http://schemas.openxmlformats.org/drawingml/2006/picture">
+                <pic:pic xmlns:pic="http://schemas.openxmlformats.org/drawingml/2006/picture">
+                  <pic:nvPicPr>
+                    <pic:cNvPr id="150056736" name=""/>
+                    <pic:cNvPicPr/>
+                  </pic:nvPicPr>
+                  <pic:blipFill>
+                    <a:blip r:embed="rId17"/>
+                    <a:stretch>
+                      <a:fillRect/>
+                    </a:stretch>
+                  </pic:blipFill>
+                  <pic:spPr>
+                    <a:xfrm>
+                      <a:off x="0" y="0"/>
+                      <a:ext cx="4860936" cy="3410824"/>
+                    </a:xfrm>
+                    <a:prstGeom prst="rect">
+                      <a:avLst/>
+                    </a:prstGeom>
+                  </pic:spPr>
+                </pic:pic>
+              </a:graphicData>
+            </a:graphic>
+          </wp:inline>
+        </w:drawing>
+      </w:r>
+    </w:p>
+    <w:p>
+      <w:pPr>
+        <w:rPr>
+          <w:sz w:val="26"/>
+          <w:szCs w:val="26"/>
+        </w:rPr>
+      </w:pPr>
+      <w:r>
+        <w:rPr>
+          <w:sz w:val="26"/>
+          <w:szCs w:val="26"/>
+        </w:rPr>
+        <w:t>Unfortunately</w:t>
+      </w:r>
+      <w:r>
+        <w:rPr>
+          <w:sz w:val="26"/>
+          <w:szCs w:val="26"/>
+        </w:rPr>
+        <w:t>, it returned me just an empty page.</w:t>
+      </w:r>
+    </w:p>
+    <w:p>
+      <w:pPr>
+        <w:rPr>
+          <w:sz w:val="26"/>
+          <w:szCs w:val="26"/>
+        </w:rPr>
+      </w:pPr>
+      <w:r>
+        <w:rPr>
+          <w:sz w:val="26"/>
+          <w:szCs w:val="26"/>
+        </w:rPr>
+        <w:lastRenderedPageBreak/>
+        <w:t xml:space="preserve">I </w:t>
+      </w:r>
+      <w:r>
+        <w:rPr>
+          <w:sz w:val="26"/>
+          <w:szCs w:val="26"/>
+        </w:rPr>
+        <w:t>returned</w:t>
+      </w:r>
+      <w:r>
+        <w:rPr>
+          <w:sz w:val="26"/>
+          <w:szCs w:val="26"/>
+        </w:rPr>
+        <w:t xml:space="preserve"> to the ftp server but before I closed it I just wanted to be fully sure that it nothing else than the marked.txt file, and after running ls -all I really found it:</w:t>
+      </w:r>
+    </w:p>
+    <w:p>
+      <w:pPr>
+        <w:rPr>
+          <w:sz w:val="26"/>
+          <w:szCs w:val="26"/>
+        </w:rPr>
+      </w:pPr>
+      <w:r>
+        <w:rPr>
+          <w:sz w:val="26"/>
+          <w:szCs w:val="26"/>
+        </w:rPr>
+        <w:drawing>
+          <wp:inline distT="0" distB="0" distL="0" distR="0" wp14:anchorId="4C65D72B" wp14:editId="79FC5CA4">
+            <wp:extent cx="4134208" cy="1009738"/>
+            <wp:effectExtent l="0" t="0" r="0" b="0"/>
+            <wp:docPr id="1579571736" name="תמונה 1"/>
+            <wp:cNvGraphicFramePr>
+              <a:graphicFrameLocks xmlns:a="http://schemas.openxmlformats.org/drawingml/2006/main" noChangeAspect="1"/>
+            </wp:cNvGraphicFramePr>
+            <a:graphic xmlns:a="http://schemas.openxmlformats.org/drawingml/2006/main">
+              <a:graphicData uri="http://schemas.openxmlformats.org/drawingml/2006/picture">
+                <pic:pic xmlns:pic="http://schemas.openxmlformats.org/drawingml/2006/picture">
+                  <pic:nvPicPr>
+                    <pic:cNvPr id="1579571736" name=""/>
+                    <pic:cNvPicPr/>
+                  </pic:nvPicPr>
+                  <pic:blipFill>
+                    <a:blip r:embed="rId18"/>
+                    <a:stretch>
+                      <a:fillRect/>
+                    </a:stretch>
+                  </pic:blipFill>
+                  <pic:spPr>
+                    <a:xfrm>
+                      <a:off x="0" y="0"/>
+                      <a:ext cx="4134208" cy="1009738"/>
+                    </a:xfrm>
+                    <a:prstGeom prst="rect">
+                      <a:avLst/>
+                    </a:prstGeom>
+                  </pic:spPr>
+                </pic:pic>
+              </a:graphicData>
+            </a:graphic>
+          </wp:inline>
+        </w:drawing>
+      </w:r>
+    </w:p>
+    <w:p>
+      <w:pPr>
+        <w:rPr>
+          <w:sz w:val="26"/>
+          <w:szCs w:val="26"/>
+        </w:rPr>
+      </w:pPr>
+      <w:r>
+        <w:rPr>
+          <w:sz w:val="26"/>
+          <w:szCs w:val="26"/>
+        </w:rPr>
+        <w:t xml:space="preserve">After transferring it to my machine, I </w:t>
+      </w:r>
+      <w:r>
+        <w:rPr>
+          <w:sz w:val="26"/>
+          <w:szCs w:val="26"/>
+        </w:rPr>
+        <w:t>opened it but all what I saw was gibberis</w:t>
+      </w:r>
+      <w:r>
+        <w:rPr>
+          <w:sz w:val="26"/>
+          <w:szCs w:val="26"/>
+        </w:rPr>
+        <w:t xml:space="preserve">h. This led me to try and run strings over it to maybe find anything readable </w:t>
+      </w:r>
+      <w:r>
+        <w:rPr>
+          <w:sz w:val="26"/>
+          <w:szCs w:val="26"/>
+        </w:rPr>
+        <w:t>and</w:t>
+      </w:r>
+      <w:r>
+        <w:rPr>
+          <w:sz w:val="26"/>
+          <w:szCs w:val="26"/>
+        </w:rPr>
+        <w:t xml:space="preserve"> after reading it </w:t>
+      </w:r>
+      <w:r>
+        <w:rPr>
+          <w:sz w:val="26"/>
+          <w:szCs w:val="26"/>
+        </w:rPr>
+        <w:t>and</w:t>
+      </w:r>
+      <w:r>
+        <w:rPr>
+          <w:sz w:val="26"/>
+          <w:szCs w:val="26"/>
+        </w:rPr>
+        <w:t xml:space="preserve"> running the “file” utility over it I found that this is a python compiled file</w:t>
+      </w:r>
+      <w:r>
+        <w:rPr>
+          <w:sz w:val="26"/>
+          <w:szCs w:val="26"/>
+        </w:rPr>
+        <w:t>:</w:t>
+      </w:r>
+    </w:p>
+    <w:p>
+      <w:pPr>
+        <w:rPr>
+          <w:sz w:val="26"/>
+          <w:szCs w:val="26"/>
+        </w:rPr>
+      </w:pPr>
+      <w:r>
+        <w:rPr>
+          <w:sz w:val="26"/>
+          <w:szCs w:val="26"/>
+        </w:rPr>
+        <w:drawing>
+          <wp:inline distT="0" distB="0" distL="0" distR="0" wp14:anchorId="677B7170" wp14:editId="0F806BE5">
+            <wp:extent cx="2530532" cy="594360"/>
+            <wp:effectExtent l="0" t="0" r="3175" b="0"/>
+            <wp:docPr id="883233254" name="תמונה 1"/>
+            <wp:cNvGraphicFramePr>
+              <a:graphicFrameLocks xmlns:a="http://schemas.openxmlformats.org/drawingml/2006/main" noChangeAspect="1"/>
+            </wp:cNvGraphicFramePr>
+            <a:graphic xmlns:a="http://schemas.openxmlformats.org/drawingml/2006/main">
+              <a:graphicData uri="http://schemas.openxmlformats.org/drawingml/2006/picture">
+                <pic:pic xmlns:pic="http://schemas.openxmlformats.org/drawingml/2006/picture">
+                  <pic:nvPicPr>
+                    <pic:cNvPr id="883233254" name=""/>
+                    <pic:cNvPicPr/>
+                  </pic:nvPicPr>
+                  <pic:blipFill>
+                    <a:blip r:embed="rId19"/>
+                    <a:stretch>
+                      <a:fillRect/>
+                    </a:stretch>
+                  </pic:blipFill>
+                  <pic:spPr>
+                    <a:xfrm>
+                      <a:off x="0" y="0"/>
+                      <a:ext cx="2531304" cy="594541"/>
+                    </a:xfrm>
+                    <a:prstGeom prst="rect">
+                      <a:avLst/>
+                    </a:prstGeom>
+                  </pic:spPr>
+                </pic:pic>
+              </a:graphicData>
+            </a:graphic>
+          </wp:inline>
+        </w:drawing>
+      </w:r>
+    </w:p>
+    <w:p>
+      <w:pPr>
+        <w:rPr>
+          <w:sz w:val="26"/>
+          <w:szCs w:val="26"/>
+        </w:rPr>
+      </w:pPr>
+      <w:r>
+        <w:rPr>
+          <w:sz w:val="26"/>
+          <w:szCs w:val="26"/>
+        </w:rPr>
+        <w:t xml:space="preserve">Now, </w:t>
+      </w:r>
+      <w:r>
+        <w:rPr>
+          <w:sz w:val="26"/>
+          <w:szCs w:val="26"/>
+        </w:rPr>
+        <w:t xml:space="preserve">I </w:t>
+      </w:r>
+      <w:r>
+        <w:rPr>
+          <w:sz w:val="26"/>
+          <w:szCs w:val="26"/>
+        </w:rPr>
+        <w:t xml:space="preserve">decided to reverse engineer this file to </w:t>
+      </w:r>
+      <w:r>
+        <w:rPr>
+          <w:sz w:val="26"/>
+          <w:szCs w:val="26"/>
+        </w:rPr>
+        <w:t>get</w:t>
+      </w:r>
+      <w:r>
+        <w:rPr>
+          <w:sz w:val="26"/>
+          <w:szCs w:val="26"/>
+        </w:rPr>
+        <w:t xml:space="preserve"> its original code:</w:t>
+      </w:r>
+    </w:p>
+    <w:p>
+      <w:pPr>
+        <w:rPr>
+          <w:sz w:val="26"/>
+          <w:szCs w:val="26"/>
+        </w:rPr>
+      </w:pPr>
+    </w:p>
+    <w:p>
+      <w:pPr>
+        <w:rPr>
+          <w:sz w:val="26"/>
+          <w:szCs w:val="26"/>
+        </w:rPr>
+      </w:pPr>
+    </w:p>
+    <w:p>
+      <w:pPr>
+        <w:rPr>
+          <w:rFonts w:hint="cs"/>
+          <w:sz w:val="26"/>
+          <w:szCs w:val="26"/>
+          <w:rtl/>
+        </w:rPr>
+      </w:pPr>
     </w:p>
     <w:sectPr>
       <w:pgSz w:w="12240" w:h="15840"/>

</xml_diff>

<commit_message>
Continue the fortress thm ctf
</commit_message>
<xml_diff>
--- a/THM_challenges/Medium/Fortress/Fortress_Solution_Documentation.docx
+++ b/THM_challenges/Medium/Fortress/Fortress_Solution_Documentation.docx
@@ -90,7 +90,7 @@
                     <pic:cNvPicPr/>
                   </pic:nvPicPr>
                   <pic:blipFill>
-                    <a:blip r:embed="rId4"/>
+                    <a:blip r:embed="rId5"/>
                     <a:stretch>
                       <a:fillRect/>
                     </a:stretch>
@@ -148,7 +148,7 @@
                     <pic:cNvPicPr/>
                   </pic:nvPicPr>
                   <pic:blipFill>
-                    <a:blip r:embed="rId5"/>
+                    <a:blip r:embed="rId6"/>
                     <a:stretch>
                       <a:fillRect/>
                     </a:stretch>
@@ -256,7 +256,7 @@
                     <pic:cNvPicPr/>
                   </pic:nvPicPr>
                   <pic:blipFill>
-                    <a:blip r:embed="rId6"/>
+                    <a:blip r:embed="rId7"/>
                     <a:stretch>
                       <a:fillRect/>
                     </a:stretch>
@@ -343,7 +343,7 @@
                     <pic:cNvPicPr/>
                   </pic:nvPicPr>
                   <pic:blipFill>
-                    <a:blip r:embed="rId7"/>
+                    <a:blip r:embed="rId8"/>
                     <a:stretch>
                       <a:fillRect/>
                     </a:stretch>
@@ -476,7 +476,7 @@
                     <pic:cNvPicPr/>
                   </pic:nvPicPr>
                   <pic:blipFill>
-                    <a:blip r:embed="rId8"/>
+                    <a:blip r:embed="rId9"/>
                     <a:stretch>
                       <a:fillRect/>
                     </a:stretch>
@@ -569,7 +569,7 @@
                     <pic:cNvPicPr/>
                   </pic:nvPicPr>
                   <pic:blipFill>
-                    <a:blip r:embed="rId9"/>
+                    <a:blip r:embed="rId10"/>
                     <a:stretch>
                       <a:fillRect/>
                     </a:stretch>
@@ -646,7 +646,7 @@
                     <pic:cNvPicPr/>
                   </pic:nvPicPr>
                   <pic:blipFill>
-                    <a:blip r:embed="rId10"/>
+                    <a:blip r:embed="rId11"/>
                     <a:stretch>
                       <a:fillRect/>
                     </a:stretch>
@@ -709,7 +709,7 @@
                     <pic:cNvPicPr/>
                   </pic:nvPicPr>
                   <pic:blipFill>
-                    <a:blip r:embed="rId11"/>
+                    <a:blip r:embed="rId12"/>
                     <a:stretch>
                       <a:fillRect/>
                     </a:stretch>
@@ -795,7 +795,7 @@
                     <pic:cNvPicPr/>
                   </pic:nvPicPr>
                   <pic:blipFill>
-                    <a:blip r:embed="rId12"/>
+                    <a:blip r:embed="rId13"/>
                     <a:stretch>
                       <a:fillRect/>
                     </a:stretch>
@@ -1095,6 +1095,7 @@
       </w:pPr>
       <w:r>
         <w:rPr>
+          <w:noProof/>
           <w:sz w:val="26"/>
           <w:szCs w:val="26"/>
         </w:rPr>
@@ -1114,7 +1115,7 @@
                     <pic:cNvPicPr/>
                   </pic:nvPicPr>
                   <pic:blipFill>
-                    <a:blip r:embed="rId13"/>
+                    <a:blip r:embed="rId14"/>
                     <a:stretch>
                       <a:fillRect/>
                     </a:stretch>
@@ -1198,7 +1199,7 @@
                     <pic:cNvPicPr/>
                   </pic:nvPicPr>
                   <pic:blipFill>
-                    <a:blip r:embed="rId14"/>
+                    <a:blip r:embed="rId15"/>
                     <a:stretch>
                       <a:fillRect/>
                     </a:stretch>
@@ -1299,6 +1300,7 @@
       </w:r>
       <w:r>
         <w:rPr>
+          <w:noProof/>
           <w:sz w:val="26"/>
           <w:szCs w:val="26"/>
         </w:rPr>
@@ -1318,7 +1320,7 @@
                     <pic:cNvPicPr/>
                   </pic:nvPicPr>
                   <pic:blipFill>
-                    <a:blip r:embed="rId15"/>
+                    <a:blip r:embed="rId16"/>
                     <a:stretch>
                       <a:fillRect/>
                     </a:stretch>
@@ -1393,6 +1395,7 @@
       </w:pPr>
       <w:r>
         <w:rPr>
+          <w:noProof/>
           <w:sz w:val="26"/>
           <w:szCs w:val="26"/>
         </w:rPr>
@@ -1412,7 +1415,7 @@
                     <pic:cNvPicPr/>
                   </pic:nvPicPr>
                   <pic:blipFill>
-                    <a:blip r:embed="rId16"/>
+                    <a:blip r:embed="rId17"/>
                     <a:stretch>
                       <a:fillRect/>
                     </a:stretch>
@@ -1457,6 +1460,7 @@
       </w:pPr>
       <w:r>
         <w:rPr>
+          <w:noProof/>
           <w:sz w:val="26"/>
           <w:szCs w:val="26"/>
         </w:rPr>
@@ -1476,7 +1480,7 @@
                     <pic:cNvPicPr/>
                   </pic:nvPicPr>
                   <pic:blipFill>
-                    <a:blip r:embed="rId17"/>
+                    <a:blip r:embed="rId18"/>
                     <a:stretch>
                       <a:fillRect/>
                     </a:stretch>
@@ -1558,6 +1562,7 @@
       </w:pPr>
       <w:r>
         <w:rPr>
+          <w:noProof/>
           <w:sz w:val="26"/>
           <w:szCs w:val="26"/>
         </w:rPr>
@@ -1577,7 +1582,7 @@
                     <pic:cNvPicPr/>
                   </pic:nvPicPr>
                   <pic:blipFill>
-                    <a:blip r:embed="rId18"/>
+                    <a:blip r:embed="rId19"/>
                     <a:stretch>
                       <a:fillRect/>
                     </a:stretch>
@@ -1671,6 +1676,7 @@
       </w:pPr>
       <w:r>
         <w:rPr>
+          <w:noProof/>
           <w:sz w:val="26"/>
           <w:szCs w:val="26"/>
         </w:rPr>
@@ -1690,7 +1696,7 @@
                     <pic:cNvPicPr/>
                   </pic:nvPicPr>
                   <pic:blipFill>
-                    <a:blip r:embed="rId19"/>
+                    <a:blip r:embed="rId20"/>
                     <a:stretch>
                       <a:fillRect/>
                     </a:stretch>
@@ -1723,7 +1729,14 @@
           <w:sz w:val="26"/>
           <w:szCs w:val="26"/>
         </w:rPr>
-        <w:t xml:space="preserve">Now, </w:t>
+        <w:t>Then</w:t>
+      </w:r>
+      <w:r>
+        <w:rPr>
+          <w:sz w:val="26"/>
+          <w:szCs w:val="26"/>
+        </w:rPr>
+        <w:t xml:space="preserve">, </w:t>
       </w:r>
       <w:r>
         <w:rPr>
@@ -1737,7 +1750,21 @@
           <w:sz w:val="26"/>
           <w:szCs w:val="26"/>
         </w:rPr>
-        <w:t xml:space="preserve">decided to reverse engineer this file to </w:t>
+        <w:t xml:space="preserve">decided to reverse </w:t>
+      </w:r>
+      <w:r>
+        <w:rPr>
+          <w:sz w:val="26"/>
+          <w:szCs w:val="26"/>
+        </w:rPr>
+        <w:t>engineer</w:t>
+      </w:r>
+      <w:r>
+        <w:rPr>
+          <w:sz w:val="26"/>
+          <w:szCs w:val="26"/>
+        </w:rPr>
+        <w:t xml:space="preserve"> this file to </w:t>
       </w:r>
       <w:r>
         <w:rPr>
@@ -1751,34 +1778,1077 @@
           <w:sz w:val="26"/>
           <w:szCs w:val="26"/>
         </w:rPr>
-        <w:t xml:space="preserve"> its original code:</w:t>
-      </w:r>
-    </w:p>
-    <w:p>
-      <w:pPr>
-        <w:rPr>
-          <w:sz w:val="26"/>
-          <w:szCs w:val="26"/>
-        </w:rPr>
-      </w:pPr>
-    </w:p>
-    <w:p>
-      <w:pPr>
-        <w:rPr>
-          <w:sz w:val="26"/>
-          <w:szCs w:val="26"/>
-        </w:rPr>
-      </w:pPr>
-    </w:p>
-    <w:p>
-      <w:pPr>
-        <w:rPr>
-          <w:rFonts w:hint="cs"/>
+        <w:t xml:space="preserve"> its original code</w:t>
+      </w:r>
+      <w:r>
+        <w:rPr>
+          <w:sz w:val="26"/>
+          <w:szCs w:val="26"/>
+        </w:rPr>
+        <w:t xml:space="preserve"> using </w:t>
+      </w:r>
+      <w:r>
+        <w:rPr>
+          <w:sz w:val="26"/>
+          <w:szCs w:val="26"/>
+        </w:rPr>
+        <w:t xml:space="preserve">a tool named </w:t>
+      </w:r>
+      <w:r>
+        <w:rPr>
+          <w:sz w:val="26"/>
+          <w:szCs w:val="26"/>
+        </w:rPr>
+        <w:t>“</w:t>
+      </w:r>
+      <w:r>
+        <w:rPr>
+          <w:sz w:val="26"/>
+          <w:szCs w:val="26"/>
+        </w:rPr>
+        <w:t>uncompyle</w:t>
+      </w:r>
+      <w:r>
+        <w:rPr>
+          <w:sz w:val="26"/>
+          <w:szCs w:val="26"/>
+        </w:rPr>
+        <w:t>2</w:t>
+      </w:r>
+      <w:r>
+        <w:rPr>
+          <w:sz w:val="26"/>
+          <w:szCs w:val="26"/>
+        </w:rPr>
+        <w:t>”</w:t>
+      </w:r>
+      <w:r>
+        <w:rPr>
+          <w:sz w:val="26"/>
+          <w:szCs w:val="26"/>
+        </w:rPr>
+        <w:t>:</w:t>
+      </w:r>
+    </w:p>
+    <w:p>
+      <w:pPr>
+        <w:rPr>
+          <w:sz w:val="26"/>
+          <w:szCs w:val="26"/>
+        </w:rPr>
+      </w:pPr>
+      <w:r>
+        <w:rPr>
+          <w:sz w:val="26"/>
+          <w:szCs w:val="26"/>
+        </w:rPr>
+        <w:t>Firstly, I downloaded this tool:</w:t>
+      </w:r>
+    </w:p>
+    <w:p>
+      <w:pPr>
+        <w:rPr>
+          <w:sz w:val="26"/>
+          <w:szCs w:val="26"/>
+        </w:rPr>
+      </w:pPr>
+      <w:r>
+        <w:rPr>
+          <w:noProof/>
+          <w:sz w:val="26"/>
+          <w:szCs w:val="26"/>
+        </w:rPr>
+        <w:drawing>
+          <wp:inline distT="0" distB="0" distL="0" distR="0" wp14:anchorId="203D3EF3" wp14:editId="68A4BE47">
+            <wp:extent cx="3334039" cy="438188"/>
+            <wp:effectExtent l="0" t="0" r="0" b="0"/>
+            <wp:docPr id="839893135" name="תמונה 1"/>
+            <wp:cNvGraphicFramePr>
+              <a:graphicFrameLocks xmlns:a="http://schemas.openxmlformats.org/drawingml/2006/main" noChangeAspect="1"/>
+            </wp:cNvGraphicFramePr>
+            <a:graphic xmlns:a="http://schemas.openxmlformats.org/drawingml/2006/main">
+              <a:graphicData uri="http://schemas.openxmlformats.org/drawingml/2006/picture">
+                <pic:pic xmlns:pic="http://schemas.openxmlformats.org/drawingml/2006/picture">
+                  <pic:nvPicPr>
+                    <pic:cNvPr id="839893135" name=""/>
+                    <pic:cNvPicPr/>
+                  </pic:nvPicPr>
+                  <pic:blipFill>
+                    <a:blip r:embed="rId21"/>
+                    <a:stretch>
+                      <a:fillRect/>
+                    </a:stretch>
+                  </pic:blipFill>
+                  <pic:spPr>
+                    <a:xfrm>
+                      <a:off x="0" y="0"/>
+                      <a:ext cx="3334039" cy="438188"/>
+                    </a:xfrm>
+                    <a:prstGeom prst="rect">
+                      <a:avLst/>
+                    </a:prstGeom>
+                  </pic:spPr>
+                </pic:pic>
+              </a:graphicData>
+            </a:graphic>
+          </wp:inline>
+        </w:drawing>
+      </w:r>
+    </w:p>
+    <w:p>
+      <w:pPr>
+        <w:rPr>
+          <w:sz w:val="26"/>
+          <w:szCs w:val="26"/>
+        </w:rPr>
+      </w:pPr>
+      <w:r>
+        <w:rPr>
+          <w:noProof/>
+          <w:sz w:val="26"/>
+          <w:szCs w:val="26"/>
+        </w:rPr>
+        <w:drawing>
+          <wp:inline distT="0" distB="0" distL="0" distR="0" wp14:anchorId="6454F7B7" wp14:editId="2AB02403">
+            <wp:extent cx="2133785" cy="304826"/>
+            <wp:effectExtent l="0" t="0" r="0" b="0"/>
+            <wp:docPr id="293198200" name="תמונה 1"/>
+            <wp:cNvGraphicFramePr>
+              <a:graphicFrameLocks xmlns:a="http://schemas.openxmlformats.org/drawingml/2006/main" noChangeAspect="1"/>
+            </wp:cNvGraphicFramePr>
+            <a:graphic xmlns:a="http://schemas.openxmlformats.org/drawingml/2006/main">
+              <a:graphicData uri="http://schemas.openxmlformats.org/drawingml/2006/picture">
+                <pic:pic xmlns:pic="http://schemas.openxmlformats.org/drawingml/2006/picture">
+                  <pic:nvPicPr>
+                    <pic:cNvPr id="293198200" name=""/>
+                    <pic:cNvPicPr/>
+                  </pic:nvPicPr>
+                  <pic:blipFill>
+                    <a:blip r:embed="rId22"/>
+                    <a:stretch>
+                      <a:fillRect/>
+                    </a:stretch>
+                  </pic:blipFill>
+                  <pic:spPr>
+                    <a:xfrm>
+                      <a:off x="0" y="0"/>
+                      <a:ext cx="2133785" cy="304826"/>
+                    </a:xfrm>
+                    <a:prstGeom prst="rect">
+                      <a:avLst/>
+                    </a:prstGeom>
+                  </pic:spPr>
+                </pic:pic>
+              </a:graphicData>
+            </a:graphic>
+          </wp:inline>
+        </w:drawing>
+      </w:r>
+    </w:p>
+    <w:p>
+      <w:pPr>
+        <w:rPr>
+          <w:sz w:val="26"/>
+          <w:szCs w:val="26"/>
+        </w:rPr>
+      </w:pPr>
+      <w:r>
+        <w:rPr>
+          <w:sz w:val="26"/>
+          <w:szCs w:val="26"/>
+        </w:rPr>
+        <w:t xml:space="preserve">Afterwards, I </w:t>
+      </w:r>
+      <w:r>
+        <w:rPr>
+          <w:sz w:val="26"/>
+          <w:szCs w:val="26"/>
+        </w:rPr>
+        <w:t xml:space="preserve">changed the file to </w:t>
+      </w:r>
+      <w:r>
+        <w:rPr>
+          <w:sz w:val="26"/>
+          <w:szCs w:val="26"/>
+        </w:rPr>
+        <w:t>“</w:t>
+      </w:r>
+      <w:r>
+        <w:rPr>
+          <w:sz w:val="26"/>
+          <w:szCs w:val="26"/>
+        </w:rPr>
+        <w:t>.pyc</w:t>
+      </w:r>
+      <w:r>
+        <w:rPr>
+          <w:sz w:val="26"/>
+          <w:szCs w:val="26"/>
+        </w:rPr>
+        <w:t xml:space="preserve">” </w:t>
+      </w:r>
+      <w:r>
+        <w:rPr>
+          <w:sz w:val="26"/>
+          <w:szCs w:val="26"/>
+        </w:rPr>
+        <w:t>extension</w:t>
+      </w:r>
+      <w:r>
+        <w:rPr>
+          <w:sz w:val="26"/>
+          <w:szCs w:val="26"/>
+        </w:rPr>
+        <w:t xml:space="preserve"> in order to be able to decompile it</w:t>
+      </w:r>
+      <w:r>
+        <w:rPr>
+          <w:sz w:val="26"/>
+          <w:szCs w:val="26"/>
+        </w:rPr>
+        <w:t>:</w:t>
+      </w:r>
+    </w:p>
+    <w:p>
+      <w:pPr>
+        <w:rPr>
+          <w:sz w:val="26"/>
+          <w:szCs w:val="26"/>
+        </w:rPr>
+      </w:pPr>
+      <w:r>
+        <w:rPr>
+          <w:noProof/>
+          <w:sz w:val="26"/>
+          <w:szCs w:val="26"/>
+        </w:rPr>
+        <w:drawing>
+          <wp:inline distT="0" distB="0" distL="0" distR="0" wp14:anchorId="7BC27208" wp14:editId="6D9DA7D2">
+            <wp:extent cx="2305250" cy="400085"/>
+            <wp:effectExtent l="0" t="0" r="0" b="0"/>
+            <wp:docPr id="629243996" name="תמונה 1"/>
+            <wp:cNvGraphicFramePr>
+              <a:graphicFrameLocks xmlns:a="http://schemas.openxmlformats.org/drawingml/2006/main" noChangeAspect="1"/>
+            </wp:cNvGraphicFramePr>
+            <a:graphic xmlns:a="http://schemas.openxmlformats.org/drawingml/2006/main">
+              <a:graphicData uri="http://schemas.openxmlformats.org/drawingml/2006/picture">
+                <pic:pic xmlns:pic="http://schemas.openxmlformats.org/drawingml/2006/picture">
+                  <pic:nvPicPr>
+                    <pic:cNvPr id="629243996" name=""/>
+                    <pic:cNvPicPr/>
+                  </pic:nvPicPr>
+                  <pic:blipFill>
+                    <a:blip r:embed="rId23"/>
+                    <a:stretch>
+                      <a:fillRect/>
+                    </a:stretch>
+                  </pic:blipFill>
+                  <pic:spPr>
+                    <a:xfrm>
+                      <a:off x="0" y="0"/>
+                      <a:ext cx="2305250" cy="400085"/>
+                    </a:xfrm>
+                    <a:prstGeom prst="rect">
+                      <a:avLst/>
+                    </a:prstGeom>
+                  </pic:spPr>
+                </pic:pic>
+              </a:graphicData>
+            </a:graphic>
+          </wp:inline>
+        </w:drawing>
+      </w:r>
+    </w:p>
+    <w:p>
+      <w:pPr>
+        <w:rPr>
+          <w:sz w:val="26"/>
+          <w:szCs w:val="26"/>
+        </w:rPr>
+      </w:pPr>
+      <w:r>
+        <w:rPr>
+          <w:sz w:val="26"/>
+          <w:szCs w:val="26"/>
+        </w:rPr>
+        <w:t>Finally, I decompiled the file:</w:t>
+      </w:r>
+    </w:p>
+    <w:p>
+      <w:pPr>
+        <w:rPr>
+          <w:sz w:val="26"/>
+          <w:szCs w:val="26"/>
+        </w:rPr>
+      </w:pPr>
+      <w:r>
+        <w:rPr>
+          <w:noProof/>
+          <w:sz w:val="26"/>
+          <w:szCs w:val="26"/>
+        </w:rPr>
+        <w:drawing>
+          <wp:inline distT="0" distB="0" distL="0" distR="0" wp14:anchorId="2DBF9EC6" wp14:editId="2B3AEB78">
+            <wp:extent cx="2800593" cy="400085"/>
+            <wp:effectExtent l="0" t="0" r="0" b="0"/>
+            <wp:docPr id="642349662" name="תמונה 1"/>
+            <wp:cNvGraphicFramePr>
+              <a:graphicFrameLocks xmlns:a="http://schemas.openxmlformats.org/drawingml/2006/main" noChangeAspect="1"/>
+            </wp:cNvGraphicFramePr>
+            <a:graphic xmlns:a="http://schemas.openxmlformats.org/drawingml/2006/main">
+              <a:graphicData uri="http://schemas.openxmlformats.org/drawingml/2006/picture">
+                <pic:pic xmlns:pic="http://schemas.openxmlformats.org/drawingml/2006/picture">
+                  <pic:nvPicPr>
+                    <pic:cNvPr id="642349662" name=""/>
+                    <pic:cNvPicPr/>
+                  </pic:nvPicPr>
+                  <pic:blipFill>
+                    <a:blip r:embed="rId24"/>
+                    <a:stretch>
+                      <a:fillRect/>
+                    </a:stretch>
+                  </pic:blipFill>
+                  <pic:spPr>
+                    <a:xfrm>
+                      <a:off x="0" y="0"/>
+                      <a:ext cx="2800593" cy="400085"/>
+                    </a:xfrm>
+                    <a:prstGeom prst="rect">
+                      <a:avLst/>
+                    </a:prstGeom>
+                  </pic:spPr>
+                </pic:pic>
+              </a:graphicData>
+            </a:graphic>
+          </wp:inline>
+        </w:drawing>
+      </w:r>
+    </w:p>
+    <w:p>
+      <w:pPr>
+        <w:rPr>
+          <w:sz w:val="26"/>
+          <w:szCs w:val="26"/>
+        </w:rPr>
+      </w:pPr>
+    </w:p>
+    <w:p>
+      <w:pPr>
+        <w:rPr>
+          <w:sz w:val="26"/>
+          <w:szCs w:val="26"/>
+        </w:rPr>
+      </w:pPr>
+    </w:p>
+    <w:p>
+      <w:pPr>
+        <w:rPr>
+          <w:sz w:val="26"/>
+          <w:szCs w:val="26"/>
+        </w:rPr>
+      </w:pPr>
+    </w:p>
+    <w:p>
+      <w:pPr>
+        <w:rPr>
+          <w:sz w:val="26"/>
+          <w:szCs w:val="26"/>
+        </w:rPr>
+      </w:pPr>
+    </w:p>
+    <w:p>
+      <w:pPr>
+        <w:rPr>
+          <w:sz w:val="26"/>
+          <w:szCs w:val="26"/>
+        </w:rPr>
+      </w:pPr>
+    </w:p>
+    <w:p>
+      <w:pPr>
+        <w:rPr>
+          <w:sz w:val="26"/>
+          <w:szCs w:val="26"/>
+        </w:rPr>
+      </w:pPr>
+    </w:p>
+    <w:p>
+      <w:pPr>
+        <w:rPr>
+          <w:sz w:val="26"/>
+          <w:szCs w:val="26"/>
+        </w:rPr>
+      </w:pPr>
+    </w:p>
+    <w:p>
+      <w:pPr>
+        <w:rPr>
+          <w:sz w:val="26"/>
+          <w:szCs w:val="26"/>
+        </w:rPr>
+      </w:pPr>
+    </w:p>
+    <w:p>
+      <w:pPr>
+        <w:rPr>
+          <w:sz w:val="26"/>
+          <w:szCs w:val="26"/>
+        </w:rPr>
+      </w:pPr>
+    </w:p>
+    <w:p>
+      <w:pPr>
+        <w:rPr>
+          <w:sz w:val="26"/>
+          <w:szCs w:val="26"/>
+        </w:rPr>
+      </w:pPr>
+      <w:r>
+        <w:rPr>
+          <w:sz w:val="26"/>
+          <w:szCs w:val="26"/>
+        </w:rPr>
+        <w:lastRenderedPageBreak/>
+        <w:t>And this is the code:</w:t>
+      </w:r>
+    </w:p>
+    <w:p>
+      <w:pPr>
+        <w:rPr>
+          <w:sz w:val="26"/>
+          <w:szCs w:val="26"/>
+        </w:rPr>
+      </w:pPr>
+      <w:r>
+        <w:rPr>
+          <w:noProof/>
+        </w:rPr>
+        <w:drawing>
+          <wp:inline distT="0" distB="0" distL="0" distR="0" wp14:anchorId="6FAB5FED" wp14:editId="15BA040E">
+            <wp:extent cx="4415790" cy="4709681"/>
+            <wp:effectExtent l="0" t="0" r="3810" b="0"/>
+            <wp:docPr id="1064501319" name="תמונה 1"/>
+            <wp:cNvGraphicFramePr>
+              <a:graphicFrameLocks xmlns:a="http://schemas.openxmlformats.org/drawingml/2006/main" noChangeAspect="1"/>
+            </wp:cNvGraphicFramePr>
+            <a:graphic xmlns:a="http://schemas.openxmlformats.org/drawingml/2006/main">
+              <a:graphicData uri="http://schemas.openxmlformats.org/drawingml/2006/picture">
+                <pic:pic xmlns:pic="http://schemas.openxmlformats.org/drawingml/2006/picture">
+                  <pic:nvPicPr>
+                    <pic:cNvPr id="1064501319" name=""/>
+                    <pic:cNvPicPr/>
+                  </pic:nvPicPr>
+                  <pic:blipFill>
+                    <a:blip r:embed="rId25"/>
+                    <a:stretch>
+                      <a:fillRect/>
+                    </a:stretch>
+                  </pic:blipFill>
+                  <pic:spPr>
+                    <a:xfrm>
+                      <a:off x="0" y="0"/>
+                      <a:ext cx="4441935" cy="4737566"/>
+                    </a:xfrm>
+                    <a:prstGeom prst="rect">
+                      <a:avLst/>
+                    </a:prstGeom>
+                  </pic:spPr>
+                </pic:pic>
+              </a:graphicData>
+            </a:graphic>
+          </wp:inline>
+        </w:drawing>
+      </w:r>
+    </w:p>
+    <w:p>
+      <w:pPr>
+        <w:rPr>
+          <w:sz w:val="26"/>
+          <w:szCs w:val="26"/>
+        </w:rPr>
+      </w:pPr>
+      <w:r>
+        <w:rPr>
+          <w:sz w:val="26"/>
+          <w:szCs w:val="26"/>
+        </w:rPr>
+        <w:t xml:space="preserve">After analyzing the </w:t>
+      </w:r>
+      <w:r>
+        <w:rPr>
+          <w:sz w:val="26"/>
+          <w:szCs w:val="26"/>
+        </w:rPr>
+        <w:t>code,</w:t>
+      </w:r>
+      <w:r>
+        <w:rPr>
+          <w:sz w:val="26"/>
+          <w:szCs w:val="26"/>
+        </w:rPr>
+        <w:t xml:space="preserve"> I understood </w:t>
+      </w:r>
+      <w:r>
+        <w:rPr>
+          <w:sz w:val="26"/>
+          <w:szCs w:val="26"/>
+        </w:rPr>
+        <w:t>a few important</w:t>
+      </w:r>
+      <w:r>
+        <w:rPr>
+          <w:sz w:val="26"/>
+          <w:szCs w:val="26"/>
+        </w:rPr>
+        <w:t xml:space="preserve"> things</w:t>
+      </w:r>
+      <w:r>
+        <w:rPr>
+          <w:sz w:val="26"/>
+          <w:szCs w:val="26"/>
+        </w:rPr>
+        <w:t>:</w:t>
+      </w:r>
+    </w:p>
+    <w:p>
+      <w:pPr>
+        <w:pStyle w:val="a9"/>
+        <w:numPr>
+          <w:ilvl w:val="0"/>
+          <w:numId w:val="1"/>
+        </w:numPr>
+        <w:rPr>
+          <w:sz w:val="26"/>
+          <w:szCs w:val="26"/>
+        </w:rPr>
+      </w:pPr>
+      <w:r>
+        <w:rPr>
+          <w:sz w:val="26"/>
+          <w:szCs w:val="26"/>
+        </w:rPr>
+        <w:t>The backdoor file that was mentioned</w:t>
+      </w:r>
+      <w:r>
+        <w:rPr>
+          <w:sz w:val="26"/>
+          <w:szCs w:val="26"/>
+        </w:rPr>
+        <w:t xml:space="preserve"> in the marked.txt file</w:t>
+      </w:r>
+      <w:r>
+        <w:rPr>
+          <w:sz w:val="26"/>
+          <w:szCs w:val="26"/>
+        </w:rPr>
+        <w:t xml:space="preserve"> is located in “../backdoor/backdoor.py”</w:t>
+      </w:r>
+    </w:p>
+    <w:p>
+      <w:pPr>
+        <w:pStyle w:val="a9"/>
+        <w:numPr>
+          <w:ilvl w:val="0"/>
+          <w:numId w:val="1"/>
+        </w:numPr>
+        <w:rPr>
+          <w:sz w:val="26"/>
+          <w:szCs w:val="26"/>
+        </w:rPr>
+      </w:pPr>
+      <w:r>
+        <w:rPr>
+          <w:sz w:val="26"/>
+          <w:szCs w:val="26"/>
+        </w:rPr>
+        <w:t xml:space="preserve">The </w:t>
+      </w:r>
+      <w:r>
+        <w:rPr>
+          <w:sz w:val="26"/>
+          <w:szCs w:val="26"/>
+        </w:rPr>
+        <w:t xml:space="preserve">right </w:t>
+      </w:r>
+      <w:r>
+        <w:rPr>
+          <w:sz w:val="26"/>
+          <w:szCs w:val="26"/>
+        </w:rPr>
+        <w:t>credentials (username and password) to connect to the login page in the service in port 5752 are</w:t>
+      </w:r>
+      <w:r>
+        <w:rPr>
+          <w:sz w:val="26"/>
+          <w:szCs w:val="26"/>
+        </w:rPr>
+        <w:t xml:space="preserve"> </w:t>
+      </w:r>
+      <w:r>
+        <w:rPr>
+          <w:sz w:val="26"/>
+          <w:szCs w:val="26"/>
+        </w:rPr>
+        <w:t>the strings of the bytes</w:t>
+      </w:r>
+      <w:r>
+        <w:rPr>
+          <w:sz w:val="26"/>
+          <w:szCs w:val="26"/>
+        </w:rPr>
+        <w:t xml:space="preserve"> </w:t>
+      </w:r>
+      <w:r>
+        <w:rPr>
+          <w:sz w:val="26"/>
+          <w:szCs w:val="26"/>
+        </w:rPr>
+        <w:t>representation</w:t>
+      </w:r>
+      <w:r>
+        <w:rPr>
+          <w:sz w:val="26"/>
+          <w:szCs w:val="26"/>
+        </w:rPr>
+        <w:t xml:space="preserve"> format</w:t>
+      </w:r>
+      <w:r>
+        <w:rPr>
+          <w:sz w:val="26"/>
+          <w:szCs w:val="26"/>
+        </w:rPr>
+        <w:t xml:space="preserve"> of the long </w:t>
+      </w:r>
+      <w:r>
+        <w:rPr>
+          <w:sz w:val="26"/>
+          <w:szCs w:val="26"/>
+        </w:rPr>
+        <w:t>representation</w:t>
+      </w:r>
+      <w:r>
+        <w:rPr>
+          <w:sz w:val="26"/>
+          <w:szCs w:val="26"/>
+        </w:rPr>
+        <w:t xml:space="preserve"> </w:t>
+      </w:r>
+      <w:r>
+        <w:rPr>
+          <w:sz w:val="26"/>
+          <w:szCs w:val="26"/>
+        </w:rPr>
+        <w:t xml:space="preserve">format </w:t>
+      </w:r>
+      <w:r>
+        <w:rPr>
+          <w:sz w:val="26"/>
+          <w:szCs w:val="26"/>
+        </w:rPr>
+        <w:t xml:space="preserve">of </w:t>
+      </w:r>
+      <w:r>
+        <w:rPr>
+          <w:sz w:val="26"/>
+          <w:szCs w:val="26"/>
+        </w:rPr>
+        <w:t>:</w:t>
+      </w:r>
+      <w:r>
+        <w:rPr>
+          <w:sz w:val="26"/>
+          <w:szCs w:val="26"/>
+        </w:rPr>
+        <w:t xml:space="preserve"> </w:t>
+      </w:r>
+      <w:r>
+        <w:rPr>
+          <w:sz w:val="26"/>
+          <w:szCs w:val="26"/>
+        </w:rPr>
+        <w:t>232340432076717036154994L</w:t>
+      </w:r>
+      <w:r>
+        <w:rPr>
+          <w:sz w:val="26"/>
+          <w:szCs w:val="26"/>
+        </w:rPr>
+        <w:t xml:space="preserve">, </w:t>
+      </w:r>
+      <w:r>
+        <w:rPr>
+          <w:sz w:val="26"/>
+          <w:szCs w:val="26"/>
+        </w:rPr>
+        <w:t>10555160959732308261529999676324629831532648692669445488L</w:t>
+      </w:r>
+    </w:p>
+    <w:p>
+      <w:pPr>
+        <w:pStyle w:val="a9"/>
+        <w:numPr>
+          <w:ilvl w:val="0"/>
+          <w:numId w:val="1"/>
+        </w:numPr>
+        <w:rPr>
+          <w:sz w:val="26"/>
+          <w:szCs w:val="26"/>
+        </w:rPr>
+      </w:pPr>
+      <w:r>
+        <w:rPr>
+          <w:sz w:val="26"/>
+          <w:szCs w:val="26"/>
+        </w:rPr>
+        <w:t xml:space="preserve">The </w:t>
+      </w:r>
+      <w:r>
+        <w:rPr>
+          <w:sz w:val="26"/>
+          <w:szCs w:val="26"/>
+        </w:rPr>
+        <w:t>file contains the login system backend side</w:t>
+      </w:r>
+      <w:r>
+        <w:rPr>
+          <w:sz w:val="26"/>
+          <w:szCs w:val="26"/>
+        </w:rPr>
+        <w:t xml:space="preserve"> code</w:t>
+      </w:r>
+      <w:r>
+        <w:rPr>
+          <w:sz w:val="26"/>
+          <w:szCs w:val="26"/>
+        </w:rPr>
+        <w:t>.</w:t>
+      </w:r>
+    </w:p>
+    <w:p>
+      <w:pPr>
+        <w:rPr>
+          <w:sz w:val="26"/>
+          <w:szCs w:val="26"/>
+        </w:rPr>
+      </w:pPr>
+      <w:r>
+        <w:rPr>
+          <w:sz w:val="26"/>
+          <w:szCs w:val="26"/>
+        </w:rPr>
+        <w:t>So</w:t>
+      </w:r>
+      <w:r>
+        <w:rPr>
+          <w:sz w:val="26"/>
+          <w:szCs w:val="26"/>
+        </w:rPr>
+        <w:t>,</w:t>
+      </w:r>
+      <w:r>
+        <w:rPr>
+          <w:sz w:val="26"/>
+          <w:szCs w:val="26"/>
+        </w:rPr>
+        <w:t xml:space="preserve"> I order to find the actual credentials I wrote this py </w:t>
+      </w:r>
+      <w:r>
+        <w:rPr>
+          <w:sz w:val="26"/>
+          <w:szCs w:val="26"/>
+        </w:rPr>
+        <w:t>script</w:t>
+      </w:r>
+      <w:r>
+        <w:rPr>
+          <w:sz w:val="26"/>
+          <w:szCs w:val="26"/>
+        </w:rPr>
+        <w:t xml:space="preserve"> named “credentials_revealing.py</w:t>
+      </w:r>
+      <w:r>
+        <w:rPr>
+          <w:sz w:val="26"/>
+          <w:szCs w:val="26"/>
+        </w:rPr>
+        <w:t>”</w:t>
+      </w:r>
+      <w:r>
+        <w:rPr>
+          <w:sz w:val="26"/>
+          <w:szCs w:val="26"/>
+        </w:rPr>
+        <w:t>:</w:t>
+      </w:r>
+    </w:p>
+    <w:p>
+      <w:pPr>
+        <w:rPr>
+          <w:sz w:val="26"/>
+          <w:szCs w:val="26"/>
+        </w:rPr>
+      </w:pPr>
+      <w:r>
+        <w:rPr>
+          <w:sz w:val="26"/>
+          <w:szCs w:val="26"/>
+        </w:rPr>
+        <w:drawing>
+          <wp:inline distT="0" distB="0" distL="0" distR="0" wp14:anchorId="5CDF15A7" wp14:editId="1A188CCC">
+            <wp:extent cx="6793298" cy="1143000"/>
+            <wp:effectExtent l="0" t="0" r="7620" b="0"/>
+            <wp:docPr id="1147737531" name="תמונה 1"/>
+            <wp:cNvGraphicFramePr>
+              <a:graphicFrameLocks xmlns:a="http://schemas.openxmlformats.org/drawingml/2006/main" noChangeAspect="1"/>
+            </wp:cNvGraphicFramePr>
+            <a:graphic xmlns:a="http://schemas.openxmlformats.org/drawingml/2006/main">
+              <a:graphicData uri="http://schemas.openxmlformats.org/drawingml/2006/picture">
+                <pic:pic xmlns:pic="http://schemas.openxmlformats.org/drawingml/2006/picture">
+                  <pic:nvPicPr>
+                    <pic:cNvPr id="1147737531" name=""/>
+                    <pic:cNvPicPr/>
+                  </pic:nvPicPr>
+                  <pic:blipFill>
+                    <a:blip r:embed="rId26"/>
+                    <a:stretch>
+                      <a:fillRect/>
+                    </a:stretch>
+                  </pic:blipFill>
+                  <pic:spPr>
+                    <a:xfrm>
+                      <a:off x="0" y="0"/>
+                      <a:ext cx="6796424" cy="1143526"/>
+                    </a:xfrm>
+                    <a:prstGeom prst="rect">
+                      <a:avLst/>
+                    </a:prstGeom>
+                  </pic:spPr>
+                </pic:pic>
+              </a:graphicData>
+            </a:graphic>
+          </wp:inline>
+        </w:drawing>
+      </w:r>
+      <w:r>
+        <w:rPr>
+          <w:sz w:val="26"/>
+          <w:szCs w:val="26"/>
+        </w:rPr>
+        <w:drawing>
+          <wp:inline distT="0" distB="0" distL="0" distR="0" wp14:anchorId="70570F7A" wp14:editId="4B82CB9D">
+            <wp:extent cx="6763014" cy="1264920"/>
+            <wp:effectExtent l="0" t="0" r="0" b="0"/>
+            <wp:docPr id="1329520784" name="תמונה 1" descr="תמונה שמכילה טקסט, צילום מסך, גופן&#10;&#10;תוכן בינה מלאכותית גנרטיבית עשוי להיות שגוי."/>
+            <wp:cNvGraphicFramePr>
+              <a:graphicFrameLocks xmlns:a="http://schemas.openxmlformats.org/drawingml/2006/main" noChangeAspect="1"/>
+            </wp:cNvGraphicFramePr>
+            <a:graphic xmlns:a="http://schemas.openxmlformats.org/drawingml/2006/main">
+              <a:graphicData uri="http://schemas.openxmlformats.org/drawingml/2006/picture">
+                <pic:pic xmlns:pic="http://schemas.openxmlformats.org/drawingml/2006/picture">
+                  <pic:nvPicPr>
+                    <pic:cNvPr id="1329520784" name="תמונה 1" descr="תמונה שמכילה טקסט, צילום מסך, גופן&#10;&#10;תוכן בינה מלאכותית גנרטיבית עשוי להיות שגוי."/>
+                    <pic:cNvPicPr/>
+                  </pic:nvPicPr>
+                  <pic:blipFill>
+                    <a:blip r:embed="rId27"/>
+                    <a:stretch>
+                      <a:fillRect/>
+                    </a:stretch>
+                  </pic:blipFill>
+                  <pic:spPr>
+                    <a:xfrm>
+                      <a:off x="0" y="0"/>
+                      <a:ext cx="6803730" cy="1272535"/>
+                    </a:xfrm>
+                    <a:prstGeom prst="rect">
+                      <a:avLst/>
+                    </a:prstGeom>
+                  </pic:spPr>
+                </pic:pic>
+              </a:graphicData>
+            </a:graphic>
+          </wp:inline>
+        </w:drawing>
+      </w:r>
+    </w:p>
+    <w:p>
+      <w:pPr>
+        <w:rPr>
+          <w:sz w:val="26"/>
+          <w:szCs w:val="26"/>
+        </w:rPr>
+      </w:pPr>
+      <w:r>
+        <w:rPr>
+          <w:sz w:val="26"/>
+          <w:szCs w:val="26"/>
+        </w:rPr>
+        <w:lastRenderedPageBreak/>
+        <w:t xml:space="preserve">After running this </w:t>
+      </w:r>
+      <w:r>
+        <w:rPr>
+          <w:sz w:val="26"/>
+          <w:szCs w:val="26"/>
+        </w:rPr>
+        <w:t>script,</w:t>
+      </w:r>
+      <w:r>
+        <w:rPr>
+          <w:sz w:val="26"/>
+          <w:szCs w:val="26"/>
+        </w:rPr>
+        <w:t xml:space="preserve"> I entered the decoded values back at the login system:</w:t>
+      </w:r>
+    </w:p>
+    <w:p>
+      <w:pPr>
+        <w:rPr>
+          <w:sz w:val="26"/>
+          <w:szCs w:val="26"/>
+        </w:rPr>
+      </w:pPr>
+      <w:r>
+        <w:rPr>
+          <w:sz w:val="26"/>
+          <w:szCs w:val="26"/>
+        </w:rPr>
+        <w:drawing>
+          <wp:inline distT="0" distB="0" distL="0" distR="0" wp14:anchorId="6D181E23" wp14:editId="0CEA03D8">
+            <wp:extent cx="2696289" cy="1352550"/>
+            <wp:effectExtent l="0" t="0" r="8890" b="0"/>
+            <wp:docPr id="1466642629" name="תמונה 1"/>
+            <wp:cNvGraphicFramePr>
+              <a:graphicFrameLocks xmlns:a="http://schemas.openxmlformats.org/drawingml/2006/main" noChangeAspect="1"/>
+            </wp:cNvGraphicFramePr>
+            <a:graphic xmlns:a="http://schemas.openxmlformats.org/drawingml/2006/main">
+              <a:graphicData uri="http://schemas.openxmlformats.org/drawingml/2006/picture">
+                <pic:pic xmlns:pic="http://schemas.openxmlformats.org/drawingml/2006/picture">
+                  <pic:nvPicPr>
+                    <pic:cNvPr id="1466642629" name=""/>
+                    <pic:cNvPicPr/>
+                  </pic:nvPicPr>
+                  <pic:blipFill>
+                    <a:blip r:embed="rId28"/>
+                    <a:stretch>
+                      <a:fillRect/>
+                    </a:stretch>
+                  </pic:blipFill>
+                  <pic:spPr>
+                    <a:xfrm>
+                      <a:off x="0" y="0"/>
+                      <a:ext cx="2697598" cy="1353207"/>
+                    </a:xfrm>
+                    <a:prstGeom prst="rect">
+                      <a:avLst/>
+                    </a:prstGeom>
+                  </pic:spPr>
+                </pic:pic>
+              </a:graphicData>
+            </a:graphic>
+          </wp:inline>
+        </w:drawing>
+      </w:r>
+    </w:p>
+    <w:p>
+      <w:pPr>
+        <w:rPr>
           <w:sz w:val="26"/>
           <w:szCs w:val="26"/>
           <w:rtl/>
         </w:rPr>
       </w:pPr>
+      <w:r>
+        <w:rPr>
+          <w:sz w:val="26"/>
+          <w:szCs w:val="26"/>
+        </w:rPr>
+        <w:t xml:space="preserve">And I found </w:t>
+      </w:r>
+      <w:r>
+        <w:rPr>
+          <w:sz w:val="26"/>
+          <w:szCs w:val="26"/>
+        </w:rPr>
+        <w:t>the string “</w:t>
+      </w:r>
+      <w:r>
+        <w:rPr>
+          <w:sz w:val="26"/>
+          <w:szCs w:val="26"/>
+        </w:rPr>
+        <w:t>t3mple_0f_y0ur_51n5</w:t>
+      </w:r>
+      <w:r>
+        <w:rPr>
+          <w:sz w:val="26"/>
+          <w:szCs w:val="26"/>
+        </w:rPr>
+        <w:t>”</w:t>
+      </w:r>
+      <w:r>
+        <w:rPr>
+          <w:sz w:val="26"/>
+          <w:szCs w:val="26"/>
+        </w:rPr>
+        <w:t xml:space="preserve"> which is the content of the </w:t>
+      </w:r>
+      <w:r>
+        <w:rPr>
+          <w:sz w:val="26"/>
+          <w:szCs w:val="26"/>
+        </w:rPr>
+        <w:t>“secret.txt”</w:t>
+      </w:r>
+      <w:r>
+        <w:rPr>
+          <w:sz w:val="26"/>
+          <w:szCs w:val="26"/>
+        </w:rPr>
+        <w:t xml:space="preserve">. I left it for </w:t>
+      </w:r>
+      <w:r>
+        <w:rPr>
+          <w:sz w:val="26"/>
+          <w:szCs w:val="26"/>
+        </w:rPr>
+        <w:t>the next steps</w:t>
+      </w:r>
+      <w:r>
+        <w:rPr>
+          <w:sz w:val="26"/>
+          <w:szCs w:val="26"/>
+        </w:rPr>
+        <w:t xml:space="preserve"> of the challenge</w:t>
+      </w:r>
+      <w:r>
+        <w:rPr>
+          <w:sz w:val="26"/>
+          <w:szCs w:val="26"/>
+        </w:rPr>
+        <w:t xml:space="preserve"> </w:t>
+      </w:r>
+      <w:r>
+        <w:rPr>
+          <w:sz w:val="26"/>
+          <w:szCs w:val="26"/>
+        </w:rPr>
+        <w:t>so</w:t>
+      </w:r>
+      <w:r>
+        <w:rPr>
+          <w:sz w:val="26"/>
+          <w:szCs w:val="26"/>
+        </w:rPr>
+        <w:t xml:space="preserve"> now I </w:t>
+      </w:r>
+      <w:r>
+        <w:rPr>
+          <w:sz w:val="26"/>
+          <w:szCs w:val="26"/>
+        </w:rPr>
+        <w:t xml:space="preserve">focused on </w:t>
+      </w:r>
     </w:p>
     <w:sectPr>
       <w:pgSz w:w="12240" w:h="15840"/>
@@ -1789,6 +2859,126 @@
     </w:sectPr>
   </w:body>
 </w:document>
+</file>
+
+<file path=word/numbering.xml><?xml version="1.0" encoding="utf-8"?>
+<w:numbering xmlns:wpc="http://schemas.microsoft.com/office/word/2010/wordprocessingCanvas" xmlns:cx="http://schemas.microsoft.com/office/drawing/2014/chartex" xmlns:cx1="http://schemas.microsoft.com/office/drawing/2015/9/8/chartex" xmlns:cx2="http://schemas.microsoft.com/office/drawing/2015/10/21/chartex" xmlns:cx3="http://schemas.microsoft.com/office/drawing/2016/5/9/chartex" xmlns:cx4="http://schemas.microsoft.com/office/drawing/2016/5/10/chartex" xmlns:cx5="http://schemas.microsoft.com/office/drawing/2016/5/11/chartex" xmlns:cx6="http://schemas.microsoft.com/office/drawing/2016/5/12/chartex" xmlns:cx7="http://schemas.microsoft.com/office/drawing/2016/5/13/chartex" xmlns:cx8="http://schemas.microsoft.com/office/drawing/2016/5/14/chartex" xmlns:mc="http://schemas.openxmlformats.org/markup-compatibility/2006" xmlns:aink="http://schemas.microsoft.com/office/drawing/2016/ink" xmlns:am3d="http://schemas.microsoft.com/office/drawing/2017/model3d" xmlns:o="urn:schemas-microsoft-com:office:office" xmlns:oel="http://schemas.microsoft.com/office/2019/extlst" xmlns:r="http://schemas.openxmlformats.org/officeDocument/2006/relationships" xmlns:m="http://schemas.openxmlformats.org/officeDocument/2006/math" xmlns:v="urn:schemas-microsoft-com:vml" xmlns:wp14="http://schemas.microsoft.com/office/word/2010/wordprocessingDrawing" xmlns:wp="http://schemas.openxmlformats.org/drawingml/2006/wordprocessingDrawing" xmlns:w10="urn:schemas-microsoft-com:office:word" xmlns:w="http://schemas.openxmlformats.org/wordprocessingml/2006/main" xmlns:w14="http://schemas.microsoft.com/office/word/2010/wordml" xmlns:w15="http://schemas.microsoft.com/office/word/2012/wordml" xmlns:w16cex="http://schemas.microsoft.com/office/word/2018/wordml/cex" xmlns:w16cid="http://schemas.microsoft.com/office/word/2016/wordml/cid" xmlns:w16="http://schemas.microsoft.com/office/word/2018/wordml" xmlns:w16du="http://schemas.microsoft.com/office/word/2023/wordml/word16du" xmlns:w16sdtdh="http://schemas.microsoft.com/office/word/2020/wordml/sdtdatahash" xmlns:w16sdtfl="http://schemas.microsoft.com/office/word/2024/wordml/sdtformatlock" xmlns:w16se="http://schemas.microsoft.com/office/word/2015/wordml/symex" xmlns:wpg="http://schemas.microsoft.com/office/word/2010/wordprocessingGroup" xmlns:wpi="http://schemas.microsoft.com/office/word/2010/wordprocessingInk" xmlns:wne="http://schemas.microsoft.com/office/word/2006/wordml" xmlns:wps="http://schemas.microsoft.com/office/word/2010/wordprocessingShape" mc:Ignorable="w14 w15 w16se w16cid w16 w16cex w16sdtdh w16sdtfl w16du wp14">
+  <w:abstractNum w:abstractNumId="0" w15:restartNumberingAfterBreak="0">
+    <w:nsid w:val="3BA74675"/>
+    <w:multiLevelType w:val="hybridMultilevel"/>
+    <w:tmpl w:val="CC5A2498"/>
+    <w:lvl w:ilvl="0" w:tplc="F02C8B92">
+      <w:numFmt w:val="bullet"/>
+      <w:lvlText w:val=""/>
+      <w:lvlJc w:val="left"/>
+      <w:pPr>
+        <w:ind w:left="720" w:hanging="360"/>
+      </w:pPr>
+      <w:rPr>
+        <w:rFonts w:ascii="Symbol" w:eastAsiaTheme="minorHAnsi" w:hAnsi="Symbol" w:cstheme="minorBidi" w:hint="default"/>
+      </w:rPr>
+    </w:lvl>
+    <w:lvl w:ilvl="1" w:tplc="04090003" w:tentative="1">
+      <w:start w:val="1"/>
+      <w:numFmt w:val="bullet"/>
+      <w:lvlText w:val="o"/>
+      <w:lvlJc w:val="left"/>
+      <w:pPr>
+        <w:ind w:left="1440" w:hanging="360"/>
+      </w:pPr>
+      <w:rPr>
+        <w:rFonts w:ascii="Courier New" w:hAnsi="Courier New" w:cs="Courier New" w:hint="default"/>
+      </w:rPr>
+    </w:lvl>
+    <w:lvl w:ilvl="2" w:tplc="04090005" w:tentative="1">
+      <w:start w:val="1"/>
+      <w:numFmt w:val="bullet"/>
+      <w:lvlText w:val=""/>
+      <w:lvlJc w:val="left"/>
+      <w:pPr>
+        <w:ind w:left="2160" w:hanging="360"/>
+      </w:pPr>
+      <w:rPr>
+        <w:rFonts w:ascii="Wingdings" w:hAnsi="Wingdings" w:hint="default"/>
+      </w:rPr>
+    </w:lvl>
+    <w:lvl w:ilvl="3" w:tplc="04090001" w:tentative="1">
+      <w:start w:val="1"/>
+      <w:numFmt w:val="bullet"/>
+      <w:lvlText w:val=""/>
+      <w:lvlJc w:val="left"/>
+      <w:pPr>
+        <w:ind w:left="2880" w:hanging="360"/>
+      </w:pPr>
+      <w:rPr>
+        <w:rFonts w:ascii="Symbol" w:hAnsi="Symbol" w:hint="default"/>
+      </w:rPr>
+    </w:lvl>
+    <w:lvl w:ilvl="4" w:tplc="04090003" w:tentative="1">
+      <w:start w:val="1"/>
+      <w:numFmt w:val="bullet"/>
+      <w:lvlText w:val="o"/>
+      <w:lvlJc w:val="left"/>
+      <w:pPr>
+        <w:ind w:left="3600" w:hanging="360"/>
+      </w:pPr>
+      <w:rPr>
+        <w:rFonts w:ascii="Courier New" w:hAnsi="Courier New" w:cs="Courier New" w:hint="default"/>
+      </w:rPr>
+    </w:lvl>
+    <w:lvl w:ilvl="5" w:tplc="04090005" w:tentative="1">
+      <w:start w:val="1"/>
+      <w:numFmt w:val="bullet"/>
+      <w:lvlText w:val=""/>
+      <w:lvlJc w:val="left"/>
+      <w:pPr>
+        <w:ind w:left="4320" w:hanging="360"/>
+      </w:pPr>
+      <w:rPr>
+        <w:rFonts w:ascii="Wingdings" w:hAnsi="Wingdings" w:hint="default"/>
+      </w:rPr>
+    </w:lvl>
+    <w:lvl w:ilvl="6" w:tplc="04090001" w:tentative="1">
+      <w:start w:val="1"/>
+      <w:numFmt w:val="bullet"/>
+      <w:lvlText w:val=""/>
+      <w:lvlJc w:val="left"/>
+      <w:pPr>
+        <w:ind w:left="5040" w:hanging="360"/>
+      </w:pPr>
+      <w:rPr>
+        <w:rFonts w:ascii="Symbol" w:hAnsi="Symbol" w:hint="default"/>
+      </w:rPr>
+    </w:lvl>
+    <w:lvl w:ilvl="7" w:tplc="04090003" w:tentative="1">
+      <w:start w:val="1"/>
+      <w:numFmt w:val="bullet"/>
+      <w:lvlText w:val="o"/>
+      <w:lvlJc w:val="left"/>
+      <w:pPr>
+        <w:ind w:left="5760" w:hanging="360"/>
+      </w:pPr>
+      <w:rPr>
+        <w:rFonts w:ascii="Courier New" w:hAnsi="Courier New" w:cs="Courier New" w:hint="default"/>
+      </w:rPr>
+    </w:lvl>
+    <w:lvl w:ilvl="8" w:tplc="04090005" w:tentative="1">
+      <w:start w:val="1"/>
+      <w:numFmt w:val="bullet"/>
+      <w:lvlText w:val=""/>
+      <w:lvlJc w:val="left"/>
+      <w:pPr>
+        <w:ind w:left="6480" w:hanging="360"/>
+      </w:pPr>
+      <w:rPr>
+        <w:rFonts w:ascii="Wingdings" w:hAnsi="Wingdings" w:hint="default"/>
+      </w:rPr>
+    </w:lvl>
+  </w:abstractNum>
+  <w:num w:numId="1" w16cid:durableId="1139108957">
+    <w:abstractNumId w:val="0"/>
+  </w:num>
+</w:numbering>
 </file>
 
 <file path=word/styles.xml><?xml version="1.0" encoding="utf-8"?>
@@ -2394,7 +3584,6 @@
   <w:style w:type="character" w:default="1" w:styleId="a0">
     <w:name w:val="Default Paragraph Font"/>
     <w:uiPriority w:val="1"/>
-    <w:semiHidden/>
     <w:unhideWhenUsed/>
   </w:style>
   <w:style w:type="table" w:default="1" w:styleId="a1">

</xml_diff>